<commit_message>
style: atualiza layout dos templates de documentos .docx
</commit_message>
<xml_diff>
--- a/public/templates/FICHA DE EVOLUÇÃO DIÁRIA- PILATES.docx
+++ b/public/templates/FICHA DE EVOLUÇÃO DIÁRIA- PILATES.docx
@@ -4,41 +4,68 @@
   <w:body>
     <w:p>
       <w:pPr>
-        <w:spacing w:after="240" w:before="240" w:lineRule="auto"/>
-        <w:rPr>
-          <w:rFonts w:ascii="Arial" w:cs="Arial" w:eastAsia="Arial" w:hAnsi="Arial"/>
-          <w:b w:val="1"/>
-          <w:bCs w:val="1"/>
-        </w:rPr>
-      </w:pPr>
-      <w:r>
-        <w:rPr>
-          <w:rFonts w:ascii="Arial" w:cs="Arial" w:eastAsia="Arial" w:hAnsi="Arial"/>
-          <w:b w:val="1"/>
-          <w:bCs w:val="1"/>
-          <w:rtl w:val="0"/>
-        </w:rPr>
-        <w:t xml:space="preserve">Dra. Shara – Fisioterapeuta CREFITO-4/ 40974-F</w:t>
-      </w:r>
-    </w:p>
-    <w:p>
-      <w:pPr>
-        <w:pStyle w:val="Heading1"/>
-        <w:keepNext w:val="0"/>
-        <w:keepLines w:val="0"/>
-        <w:rPr>
-          <w:rFonts w:ascii="Arial" w:cs="Arial" w:eastAsia="Arial" w:hAnsi="Arial"/>
-          <w:sz w:val="46"/>
-          <w:szCs w:val="46"/>
-        </w:rPr>
-      </w:pPr>
-      <w:bookmarkStart w:colFirst="0" w:colLast="0" w:name="_heading=h.2joo9hi37f7h" w:id="0"/>
-      <w:bookmarkEnd w:id="0"/>
-      <w:r>
-        <w:rPr>
-          <w:rFonts w:ascii="Arial" w:cs="Arial" w:eastAsia="Arial" w:hAnsi="Arial"/>
-          <w:sz w:val="46"/>
-          <w:szCs w:val="46"/>
+        <w:jc w:val="center"/>
+        <w:rPr>
+          <w:b w:val="1"/>
+          <w:bCs w:val="1"/>
+          <w:sz w:val="28"/>
+          <w:szCs w:val="28"/>
+        </w:rPr>
+      </w:pPr>
+      <w:r>
+        <w:rPr>
+          <w:rtl w:val="0"/>
+        </w:rPr>
+      </w:r>
+    </w:p>
+    <w:p>
+      <w:pPr>
+        <w:jc w:val="center"/>
+        <w:rPr>
+          <w:b w:val="1"/>
+          <w:bCs w:val="1"/>
+          <w:sz w:val="28"/>
+          <w:szCs w:val="28"/>
+        </w:rPr>
+      </w:pPr>
+      <w:r>
+        <w:rPr>
+          <w:rtl w:val="0"/>
+        </w:rPr>
+      </w:r>
+    </w:p>
+    <w:p>
+      <w:pPr>
+        <w:jc w:val="center"/>
+        <w:rPr>
+          <w:b w:val="1"/>
+          <w:bCs w:val="1"/>
+          <w:sz w:val="28"/>
+          <w:szCs w:val="28"/>
+        </w:rPr>
+      </w:pPr>
+      <w:r>
+        <w:rPr>
+          <w:rtl w:val="0"/>
+        </w:rPr>
+      </w:r>
+    </w:p>
+    <w:p>
+      <w:pPr>
+        <w:jc w:val="center"/>
+        <w:rPr>
+          <w:b w:val="1"/>
+          <w:bCs w:val="1"/>
+          <w:sz w:val="32"/>
+          <w:szCs w:val="32"/>
+        </w:rPr>
+      </w:pPr>
+      <w:r>
+        <w:rPr>
+          <w:b w:val="1"/>
+          <w:bCs w:val="1"/>
+          <w:sz w:val="32"/>
+          <w:szCs w:val="32"/>
           <w:rtl w:val="0"/>
         </w:rPr>
         <w:t xml:space="preserve">FICHA DE EVOLUÇÃO DIÁRIA / PILATES</w:t>
@@ -46,18 +73,20 @@
     </w:p>
     <w:p>
       <w:pPr>
-        <w:spacing w:after="240" w:before="240" w:lineRule="auto"/>
-        <w:rPr>
-          <w:rFonts w:ascii="Arial" w:cs="Arial" w:eastAsia="Arial" w:hAnsi="Arial"/>
-          <w:b w:val="1"/>
-          <w:bCs w:val="1"/>
-        </w:rPr>
-      </w:pPr>
-      <w:r>
-        <w:rPr>
-          <w:rFonts w:ascii="Arial" w:cs="Arial" w:eastAsia="Arial" w:hAnsi="Arial"/>
-          <w:b w:val="1"/>
-          <w:bCs w:val="1"/>
+        <w:jc w:val="center"/>
+        <w:rPr>
+          <w:b w:val="1"/>
+          <w:bCs w:val="1"/>
+          <w:sz w:val="32"/>
+          <w:szCs w:val="32"/>
+        </w:rPr>
+      </w:pPr>
+      <w:r>
+        <w:rPr>
+          <w:b w:val="1"/>
+          <w:bCs w:val="1"/>
+          <w:sz w:val="32"/>
+          <w:szCs w:val="32"/>
           <w:rtl w:val="0"/>
         </w:rPr>
         <w:t xml:space="preserve">ALUNO: {{nome_paciente}}</w:t>
@@ -65,41 +94,86 @@
     </w:p>
     <w:p>
       <w:pPr>
-        <w:rPr>
-          <w:rFonts w:ascii="Arial" w:cs="Arial" w:eastAsia="Arial" w:hAnsi="Arial"/>
-          <w:b w:val="1"/>
-          <w:bCs w:val="1"/>
-        </w:rPr>
-      </w:pPr>
-      <w:r>
-        <w:pict>
-          <v:rect style="width:0.0pt;height:1.5pt" o:hr="t" o:hrstd="t" o:hralign="center" fillcolor="#A0A0A0" stroked="f"/>
-        </w:pict>
-      </w:r>
-      <w:r>
-        <w:rPr>
-          <w:rtl w:val="0"/>
-        </w:rPr>
-      </w:r>
-    </w:p>
-    <w:p>
-      <w:pPr>
-        <w:pStyle w:val="Heading3"/>
-        <w:keepNext w:val="0"/>
-        <w:keepLines w:val="0"/>
-        <w:rPr>
-          <w:rFonts w:ascii="Arial" w:cs="Arial" w:eastAsia="Arial" w:hAnsi="Arial"/>
-          <w:sz w:val="26"/>
-          <w:szCs w:val="26"/>
-        </w:rPr>
-      </w:pPr>
-      <w:bookmarkStart w:colFirst="0" w:colLast="0" w:name="_heading=h.661hrf94jlbo" w:id="1"/>
-      <w:bookmarkEnd w:id="1"/>
-      <w:r>
-        <w:rPr>
-          <w:rFonts w:ascii="Arial" w:cs="Arial" w:eastAsia="Arial" w:hAnsi="Arial"/>
-          <w:sz w:val="26"/>
-          <w:szCs w:val="26"/>
+        <w:jc w:val="center"/>
+        <w:rPr>
+          <w:b w:val="1"/>
+          <w:bCs w:val="1"/>
+          <w:sz w:val="28"/>
+          <w:szCs w:val="28"/>
+        </w:rPr>
+      </w:pPr>
+      <w:r>
+        <w:rPr>
+          <w:rtl w:val="0"/>
+        </w:rPr>
+      </w:r>
+    </w:p>
+    <w:p>
+      <w:pPr>
+        <w:jc w:val="center"/>
+        <w:rPr>
+          <w:b w:val="1"/>
+          <w:bCs w:val="1"/>
+          <w:sz w:val="28"/>
+          <w:szCs w:val="28"/>
+        </w:rPr>
+      </w:pPr>
+      <w:r>
+        <w:rPr>
+          <w:rtl w:val="0"/>
+        </w:rPr>
+      </w:r>
+    </w:p>
+    <w:p>
+      <w:pPr>
+        <w:jc w:val="center"/>
+        <w:rPr>
+          <w:b w:val="1"/>
+          <w:bCs w:val="1"/>
+          <w:sz w:val="28"/>
+          <w:szCs w:val="28"/>
+        </w:rPr>
+      </w:pPr>
+      <w:r>
+        <w:rPr>
+          <w:rtl w:val="0"/>
+        </w:rPr>
+      </w:r>
+    </w:p>
+    <w:p>
+      <w:pPr>
+        <w:rPr>
+          <w:b w:val="1"/>
+          <w:bCs w:val="1"/>
+          <w:sz w:val="28"/>
+          <w:szCs w:val="28"/>
+        </w:rPr>
+      </w:pPr>
+      <w:r>
+        <w:rPr>
+          <w:rtl w:val="0"/>
+        </w:rPr>
+      </w:r>
+    </w:p>
+    <w:p>
+      <w:pPr>
+        <w:rPr>
+          <w:b w:val="1"/>
+          <w:bCs w:val="1"/>
+          <w:i w:val="1"/>
+          <w:iCs w:val="1"/>
+          <w:sz w:val="32"/>
+          <w:szCs w:val="32"/>
+        </w:rPr>
+      </w:pPr>
+      <w:r>
+        <w:rPr>
+          <w:b w:val="1"/>
+          <w:bCs w:val="1"/>
+          <w:i w:val="1"/>
+          <w:iCs w:val="1"/>
+          <w:sz w:val="32"/>
+          <w:szCs w:val="32"/>
           <w:rtl w:val="0"/>
         </w:rPr>
         <w:t xml:space="preserve">EVOLUÇÃO DA SESSÃO</w:t>
@@ -107,58 +181,64 @@
     </w:p>
     <w:p>
       <w:pPr>
-        <w:spacing w:after="240" w:before="240" w:lineRule="auto"/>
-        <w:rPr/>
-      </w:pPr>
-      <w:r>
-        <w:rPr>
-          <w:rFonts w:ascii="Arial" w:cs="Arial" w:eastAsia="Arial" w:hAnsi="Arial"/>
-          <w:b w:val="1"/>
-          <w:bCs w:val="1"/>
+        <w:rPr>
+          <w:b w:val="1"/>
+          <w:bCs w:val="1"/>
+          <w:i w:val="1"/>
+          <w:iCs w:val="1"/>
+          <w:sz w:val="32"/>
+          <w:szCs w:val="32"/>
+        </w:rPr>
+      </w:pPr>
+      <w:r>
+        <w:rPr>
+          <w:rtl w:val="0"/>
+        </w:rPr>
+      </w:r>
+    </w:p>
+    <w:p>
+      <w:pPr>
+        <w:rPr>
+          <w:sz w:val="32"/>
+          <w:szCs w:val="32"/>
+        </w:rPr>
+      </w:pPr>
+      <w:r>
+        <w:rPr>
+          <w:sz w:val="32"/>
+          <w:szCs w:val="32"/>
           <w:rtl w:val="0"/>
         </w:rPr>
         <w:t xml:space="preserve">ENTRADA: Equipamentos: ( {{eq_cadillac}} ) Cadillac ( {{eq_reformer}} ) Reformer ( {{eq_chair}} ) Chair ( {{eq_barrel}} ) Barrel ( {{eq_solo}} ) Solo ( {{eq_outros}} ) Outros: {{descr_outros_eq}}</w:t>
       </w:r>
-      <w:r>
-        <w:rPr>
-          <w:rtl w:val="0"/>
-        </w:rPr>
-      </w:r>
-    </w:p>
-    <w:p>
-      <w:pPr>
-        <w:spacing w:after="240" w:before="240" w:lineRule="auto"/>
-        <w:rPr/>
-      </w:pPr>
-      <w:r>
-        <w:rPr>
-          <w:rFonts w:ascii="Arial" w:cs="Arial" w:eastAsia="Arial" w:hAnsi="Arial"/>
-          <w:b w:val="1"/>
-          <w:bCs w:val="1"/>
+    </w:p>
+    <w:p>
+      <w:pPr>
+        <w:rPr>
+          <w:sz w:val="32"/>
+          <w:szCs w:val="32"/>
+        </w:rPr>
+      </w:pPr>
+      <w:r>
+        <w:rPr>
+          <w:sz w:val="32"/>
+          <w:szCs w:val="32"/>
           <w:rtl w:val="0"/>
         </w:rPr>
         <w:t xml:space="preserve">Objetivos do Dia: ( {{obj_along}} ) Alongamento: ( {{al_mmss}} ) MMSS ( {{al_mmii}} ) MMII ( {{al_ant}} ) Cadeia ant. ( {{al_post}} ) Cadeia post. ( {{obj_fort}} ) Fortalecimento: ( {{ft_mmss}} ) MMSS ( {{ft_mmii}} ) MMII ( {{ft_glut}} ) Glúteo ( {{ft_abd}} ) Abdômen ( {{ft_outros}} ) Outros ( {{obj_mob}} ) Mobilização</w:t>
       </w:r>
-      <w:r>
-        <w:rPr>
-          <w:rtl w:val="0"/>
-        </w:rPr>
-      </w:r>
-    </w:p>
-    <w:p>
-      <w:pPr>
-        <w:spacing w:after="240" w:before="240" w:lineRule="auto"/>
-        <w:rPr>
-          <w:rFonts w:ascii="Arial" w:cs="Arial" w:eastAsia="Arial" w:hAnsi="Arial"/>
-          <w:b w:val="1"/>
-          <w:bCs w:val="1"/>
-        </w:rPr>
-      </w:pPr>
-      <w:r>
-        <w:rPr>
-          <w:rFonts w:ascii="Arial" w:cs="Arial" w:eastAsia="Arial" w:hAnsi="Arial"/>
-          <w:b w:val="1"/>
-          <w:bCs w:val="1"/>
+    </w:p>
+    <w:p>
+      <w:pPr>
+        <w:rPr>
+          <w:sz w:val="32"/>
+          <w:szCs w:val="32"/>
+        </w:rPr>
+      </w:pPr>
+      <w:r>
+        <w:rPr>
+          <w:sz w:val="32"/>
+          <w:szCs w:val="32"/>
           <w:rtl w:val="0"/>
         </w:rPr>
         <w:t xml:space="preserve">SAÍDA: {{notas_saida}}</w:t>
@@ -166,49 +246,272 @@
     </w:p>
     <w:p>
       <w:pPr>
-        <w:spacing w:after="0" w:before="0" w:lineRule="auto"/>
-        <w:rPr/>
-      </w:pPr>
-      <w:r>
-        <w:rPr>
-          <w:rFonts w:ascii="Arial" w:cs="Arial" w:eastAsia="Arial" w:hAnsi="Arial"/>
-          <w:b w:val="1"/>
-          <w:bCs w:val="1"/>
-          <w:rtl w:val="0"/>
-        </w:rPr>
-        <w:t xml:space="preserve">DATA: {{data_sessao}} Assinatura: _______________________ Dra. Shara | CREFITO-4/ 40974-F</w:t>
-      </w:r>
-      <w:r>
-        <w:rPr>
-          <w:rtl w:val="0"/>
-        </w:rPr>
-      </w:r>
-    </w:p>
-    <w:p>
-      <w:pPr>
-        <w:rPr>
-          <w:rFonts w:ascii="Arial" w:cs="Arial" w:eastAsia="Arial" w:hAnsi="Arial"/>
-        </w:rPr>
-      </w:pPr>
-      <w:r>
-        <w:rPr>
-          <w:rFonts w:ascii="Arial" w:cs="Arial" w:eastAsia="Arial" w:hAnsi="Arial"/>
-          <w:b w:val="1"/>
-          <w:bCs w:val="1"/>
-          <w:rtl w:val="0"/>
-        </w:rPr>
-        <w:t xml:space="preserve">                      </w:t>
-      </w:r>
-      <w:r>
-        <w:rPr>
-          <w:rtl w:val="0"/>
-        </w:rPr>
-      </w:r>
-    </w:p>
-    <w:p>
-      <w:pPr>
-        <w:rPr>
-          <w:rFonts w:ascii="Arial" w:cs="Arial" w:eastAsia="Arial" w:hAnsi="Arial"/>
+        <w:rPr>
+          <w:sz w:val="32"/>
+          <w:szCs w:val="32"/>
+        </w:rPr>
+      </w:pPr>
+      <w:r>
+        <w:rPr>
+          <w:sz w:val="32"/>
+          <w:szCs w:val="32"/>
+          <w:rtl w:val="0"/>
+        </w:rPr>
+        <w:t xml:space="preserve">DATA: {{data_sessao}}</w:t>
+      </w:r>
+    </w:p>
+    <w:p>
+      <w:pPr>
+        <w:rPr>
+          <w:b w:val="1"/>
+          <w:bCs w:val="1"/>
+          <w:sz w:val="28"/>
+          <w:szCs w:val="28"/>
+        </w:rPr>
+      </w:pPr>
+      <w:r>
+        <w:rPr>
+          <w:rtl w:val="0"/>
+        </w:rPr>
+      </w:r>
+    </w:p>
+    <w:p>
+      <w:pPr>
+        <w:rPr>
+          <w:b w:val="1"/>
+          <w:bCs w:val="1"/>
+          <w:sz w:val="28"/>
+          <w:szCs w:val="28"/>
+        </w:rPr>
+      </w:pPr>
+      <w:r>
+        <w:rPr>
+          <w:rtl w:val="0"/>
+        </w:rPr>
+      </w:r>
+    </w:p>
+    <w:p>
+      <w:pPr>
+        <w:rPr>
+          <w:b w:val="1"/>
+          <w:bCs w:val="1"/>
+          <w:sz w:val="28"/>
+          <w:szCs w:val="28"/>
+        </w:rPr>
+      </w:pPr>
+      <w:r>
+        <w:rPr>
+          <w:rtl w:val="0"/>
+        </w:rPr>
+      </w:r>
+    </w:p>
+    <w:p>
+      <w:pPr>
+        <w:rPr>
+          <w:b w:val="1"/>
+          <w:bCs w:val="1"/>
+          <w:sz w:val="28"/>
+          <w:szCs w:val="28"/>
+        </w:rPr>
+      </w:pPr>
+      <w:r>
+        <w:rPr>
+          <w:rtl w:val="0"/>
+        </w:rPr>
+      </w:r>
+    </w:p>
+    <w:p>
+      <w:pPr>
+        <w:rPr>
+          <w:b w:val="1"/>
+          <w:bCs w:val="1"/>
+          <w:sz w:val="28"/>
+          <w:szCs w:val="28"/>
+        </w:rPr>
+      </w:pPr>
+      <w:r>
+        <w:rPr>
+          <w:rtl w:val="0"/>
+        </w:rPr>
+      </w:r>
+    </w:p>
+    <w:p>
+      <w:pPr>
+        <w:rPr>
+          <w:b w:val="1"/>
+          <w:bCs w:val="1"/>
+          <w:sz w:val="28"/>
+          <w:szCs w:val="28"/>
+        </w:rPr>
+      </w:pPr>
+      <w:r>
+        <w:rPr>
+          <w:rtl w:val="0"/>
+        </w:rPr>
+      </w:r>
+    </w:p>
+    <w:p>
+      <w:pPr>
+        <w:rPr>
+          <w:b w:val="1"/>
+          <w:bCs w:val="1"/>
+          <w:sz w:val="28"/>
+          <w:szCs w:val="28"/>
+        </w:rPr>
+      </w:pPr>
+      <w:r>
+        <w:rPr>
+          <w:rtl w:val="0"/>
+        </w:rPr>
+      </w:r>
+    </w:p>
+    <w:p>
+      <w:pPr>
+        <w:jc w:val="center"/>
+        <w:rPr>
+          <w:sz w:val="28"/>
+          <w:szCs w:val="28"/>
+        </w:rPr>
+      </w:pPr>
+      <w:r>
+        <w:rPr>
+          <w:sz w:val="28"/>
+          <w:szCs w:val="28"/>
+          <w:rtl w:val="0"/>
+        </w:rPr>
+        <w:t xml:space="preserve"> Assinatura: _______________________ </w:t>
+      </w:r>
+    </w:p>
+    <w:p>
+      <w:pPr>
+        <w:jc w:val="center"/>
+        <w:rPr>
+          <w:sz w:val="28"/>
+          <w:szCs w:val="28"/>
+        </w:rPr>
+      </w:pPr>
+      <w:r>
+        <w:rPr>
+          <w:sz w:val="28"/>
+          <w:szCs w:val="28"/>
+          <w:rtl w:val="0"/>
+        </w:rPr>
+        <w:t xml:space="preserve">Dra. Shara Magaly Brilhante Bezerra</w:t>
+      </w:r>
+    </w:p>
+    <w:p>
+      <w:pPr>
+        <w:jc w:val="center"/>
+        <w:rPr>
+          <w:sz w:val="28"/>
+          <w:szCs w:val="28"/>
+        </w:rPr>
+      </w:pPr>
+      <w:r>
+        <w:rPr>
+          <w:rtl w:val="0"/>
+        </w:rPr>
+      </w:r>
+    </w:p>
+    <w:p>
+      <w:pPr>
+        <w:jc w:val="center"/>
+        <w:rPr>
+          <w:sz w:val="28"/>
+          <w:szCs w:val="28"/>
+        </w:rPr>
+      </w:pPr>
+      <w:r>
+        <w:rPr>
+          <w:rtl w:val="0"/>
+        </w:rPr>
+      </w:r>
+    </w:p>
+    <w:p>
+      <w:pPr>
+        <w:rPr>
+          <w:b w:val="1"/>
+          <w:bCs w:val="1"/>
+          <w:sz w:val="28"/>
+          <w:szCs w:val="28"/>
+        </w:rPr>
+      </w:pPr>
+      <w:r>
+        <w:rPr>
+          <w:rtl w:val="0"/>
+        </w:rPr>
+      </w:r>
+    </w:p>
+    <w:p>
+      <w:pPr>
+        <w:jc w:val="center"/>
+        <w:rPr>
+          <w:sz w:val="30"/>
+          <w:szCs w:val="30"/>
+        </w:rPr>
+      </w:pPr>
+      <w:r>
+        <w:rPr>
+          <w:rtl w:val="0"/>
+        </w:rPr>
+      </w:r>
+    </w:p>
+    <w:p>
+      <w:pPr>
+        <w:jc w:val="center"/>
+        <w:rPr>
+          <w:b w:val="1"/>
+          <w:bCs w:val="1"/>
+          <w:sz w:val="30"/>
+          <w:szCs w:val="30"/>
+        </w:rPr>
+      </w:pPr>
+      <w:r>
+        <w:rPr>
+          <w:rtl w:val="0"/>
+        </w:rPr>
+      </w:r>
+    </w:p>
+    <w:p>
+      <w:pPr>
+        <w:jc w:val="center"/>
+        <w:rPr>
+          <w:b w:val="1"/>
+          <w:bCs w:val="1"/>
+          <w:sz w:val="30"/>
+          <w:szCs w:val="30"/>
+        </w:rPr>
+      </w:pPr>
+      <w:r>
+        <w:rPr>
+          <w:rtl w:val="0"/>
+        </w:rPr>
+      </w:r>
+    </w:p>
+    <w:p>
+      <w:pPr>
+        <w:jc w:val="center"/>
+        <w:rPr>
+          <w:b w:val="1"/>
+          <w:bCs w:val="1"/>
+          <w:sz w:val="30"/>
+          <w:szCs w:val="30"/>
+        </w:rPr>
+      </w:pPr>
+      <w:r>
+        <w:rPr>
+          <w:rtl w:val="0"/>
+        </w:rPr>
+      </w:r>
+    </w:p>
+    <w:p>
+      <w:pPr>
+        <w:jc w:val="left"/>
+        <w:rPr>
+          <w:b w:val="1"/>
+          <w:bCs w:val="1"/>
+          <w:sz w:val="30"/>
+          <w:szCs w:val="30"/>
         </w:rPr>
       </w:pPr>
       <w:r>
@@ -218,12 +521,36 @@
       </w:r>
     </w:p>
     <w:sectPr>
-      <w:pgSz w:h="16838" w:w="11906" w:orient="portrait"/>
-      <w:pgMar w:bottom="1417" w:top="1417" w:left="1701" w:right="1701" w:header="708" w:footer="708"/>
+      <w:headerReference r:id="rId6" w:type="default"/>
+      <w:pgSz w:h="15840" w:w="12240" w:orient="portrait"/>
+      <w:pgMar w:bottom="1440" w:top="1440" w:left="1440" w:right="1440" w:header="720" w:footer="720"/>
       <w:pgNumType w:start="1"/>
     </w:sectPr>
   </w:body>
 </w:document>
+</file>
+
+<file path=word/header1.xml><?xml version="1.0" encoding="utf-8"?>
+<w:hdr xmlns:mc="http://schemas.openxmlformats.org/markup-compatibility/2006" xmlns:o="urn:schemas-microsoft-com:office:office" xmlns:r="http://schemas.openxmlformats.org/officeDocument/2006/relationships" xmlns:m="http://schemas.openxmlformats.org/officeDocument/2006/math" xmlns:v="urn:schemas-microsoft-com:vml" xmlns:wp="http://schemas.openxmlformats.org/drawingml/2006/wordprocessingDrawing" xmlns:w10="urn:schemas-microsoft-com:office:word" xmlns:w="http://schemas.openxmlformats.org/wordprocessingml/2006/main" xmlns:wne="http://schemas.microsoft.com/office/word/2006/wordml" xmlns:sl="http://schemas.openxmlformats.org/schemaLibrary/2006/main" xmlns:a="http://schemas.openxmlformats.org/drawingml/2006/main" xmlns:pic="http://schemas.openxmlformats.org/drawingml/2006/picture" xmlns:c="http://schemas.openxmlformats.org/drawingml/2006/chart" xmlns:lc="http://schemas.openxmlformats.org/drawingml/2006/lockedCanvas" xmlns:dgm="http://schemas.openxmlformats.org/drawingml/2006/diagram" xmlns:wps="http://schemas.microsoft.com/office/word/2010/wordprocessingShape" xmlns:wpg="http://schemas.microsoft.com/office/word/2010/wordprocessingGroup" xmlns:w14="http://schemas.microsoft.com/office/word/2010/wordml" xmlns:w15="http://schemas.microsoft.com/office/word/2012/wordml" xmlns:w16="http://schemas.microsoft.com/office/word/2018/wordml" xmlns:w16cex="http://schemas.microsoft.com/office/word/2018/wordml/cex" xmlns:w16cid="http://schemas.microsoft.com/office/word/2016/wordml/cid" xmlns="http://schemas.microsoft.com/office/tasks/2019/documenttasks" xmlns:cr="http://schemas.microsoft.com/office/comments/2020/reactions">
+  <w:p>
+    <w:pPr>
+      <w:rPr/>
+    </w:pPr>
+    <w:r>
+      <w:rPr/>
+      <w:pict>
+        <v:shape id="WordPictureWatermark1" style="position:absolute;width:617.76pt;height:795.6171617161715pt;rotation:0;z-index:-503316481;mso-position-horizontal-relative:margin;mso-position-horizontal:center;mso-position-vertical-relative:margin;mso-position-vertical:center;" alt="" type="#_x0000_t75">
+          <v:imagedata cropbottom="0f" cropleft="0f" cropright="0f" croptop="0f" r:id="rId1" o:title="image1.png"/>
+        </v:shape>
+      </w:pict>
+    </w:r>
+    <w:r>
+      <w:rPr>
+        <w:rtl w:val="0"/>
+      </w:rPr>
+    </w:r>
+  </w:p>
+</w:hdr>
 </file>
 
 <file path=word/numbering.xml><?xml version="1.0" encoding="utf-8"?>
@@ -235,15 +562,15 @@
   <w:docDefaults>
     <w:rPrDefault>
       <w:rPr>
-        <w:rFonts w:ascii="Calibri" w:cs="Calibri" w:eastAsia="Calibri" w:hAnsi="Calibri"/>
+        <w:rFonts w:ascii="Arial" w:cs="Arial" w:eastAsia="Arial" w:hAnsi="Arial"/>
         <w:sz w:val="22"/>
         <w:szCs w:val="22"/>
-        <w:lang w:val="pt_BR"/>
+        <w:lang w:val="en"/>
       </w:rPr>
     </w:rPrDefault>
     <w:pPrDefault>
       <w:pPr>
-        <w:spacing w:after="160" w:line="259" w:lineRule="auto"/>
+        <w:spacing w:line="276" w:lineRule="auto"/>
       </w:pPr>
     </w:pPrDefault>
   </w:docDefaults>
@@ -269,13 +596,11 @@
       <w:keepNext w:val="1"/>
       <w:keepLines w:val="1"/>
       <w:pageBreakBefore w:val="0"/>
-      <w:spacing w:after="120" w:before="480" w:lineRule="auto"/>
+      <w:spacing w:after="120" w:before="400" w:lineRule="auto"/>
     </w:pPr>
     <w:rPr>
-      <w:b w:val="1"/>
-      <w:bCs w:val="1"/>
-      <w:sz w:val="48"/>
-      <w:szCs w:val="48"/>
+      <w:sz w:val="40"/>
+      <w:szCs w:val="40"/>
     </w:rPr>
   </w:style>
   <w:style w:type="paragraph" w:styleId="Heading2">
@@ -286,13 +611,13 @@
       <w:keepNext w:val="1"/>
       <w:keepLines w:val="1"/>
       <w:pageBreakBefore w:val="0"/>
-      <w:spacing w:after="80" w:before="360" w:lineRule="auto"/>
+      <w:spacing w:after="120" w:before="360" w:lineRule="auto"/>
     </w:pPr>
     <w:rPr>
-      <w:b w:val="1"/>
-      <w:bCs w:val="1"/>
-      <w:sz w:val="36"/>
-      <w:szCs w:val="36"/>
+      <w:b w:val="0"/>
+      <w:bCs w:val="0"/>
+      <w:sz w:val="32"/>
+      <w:szCs w:val="32"/>
     </w:rPr>
   </w:style>
   <w:style w:type="paragraph" w:styleId="Heading3">
@@ -303,11 +628,12 @@
       <w:keepNext w:val="1"/>
       <w:keepLines w:val="1"/>
       <w:pageBreakBefore w:val="0"/>
-      <w:spacing w:after="80" w:before="280" w:lineRule="auto"/>
+      <w:spacing w:after="80" w:before="320" w:lineRule="auto"/>
     </w:pPr>
     <w:rPr>
-      <w:b w:val="1"/>
-      <w:bCs w:val="1"/>
+      <w:b w:val="0"/>
+      <w:bCs w:val="0"/>
+      <w:color w:val="434343"/>
       <w:sz w:val="28"/>
       <w:szCs w:val="28"/>
     </w:rPr>
@@ -320,11 +646,10 @@
       <w:keepNext w:val="1"/>
       <w:keepLines w:val="1"/>
       <w:pageBreakBefore w:val="0"/>
-      <w:spacing w:after="40" w:before="240" w:lineRule="auto"/>
+      <w:spacing w:after="80" w:before="280" w:lineRule="auto"/>
     </w:pPr>
     <w:rPr>
-      <w:b w:val="1"/>
-      <w:bCs w:val="1"/>
+      <w:color w:val="666666"/>
       <w:sz w:val="24"/>
       <w:szCs w:val="24"/>
     </w:rPr>
@@ -337,11 +662,10 @@
       <w:keepNext w:val="1"/>
       <w:keepLines w:val="1"/>
       <w:pageBreakBefore w:val="0"/>
-      <w:spacing w:after="40" w:before="220" w:lineRule="auto"/>
+      <w:spacing w:after="80" w:before="240" w:lineRule="auto"/>
     </w:pPr>
     <w:rPr>
-      <w:b w:val="1"/>
-      <w:bCs w:val="1"/>
+      <w:color w:val="666666"/>
       <w:sz w:val="22"/>
       <w:szCs w:val="22"/>
     </w:rPr>
@@ -354,13 +678,14 @@
       <w:keepNext w:val="1"/>
       <w:keepLines w:val="1"/>
       <w:pageBreakBefore w:val="0"/>
-      <w:spacing w:after="40" w:before="200" w:lineRule="auto"/>
+      <w:spacing w:after="80" w:before="240" w:lineRule="auto"/>
     </w:pPr>
     <w:rPr>
-      <w:b w:val="1"/>
-      <w:bCs w:val="1"/>
-      <w:sz w:val="20"/>
-      <w:szCs w:val="20"/>
+      <w:i w:val="1"/>
+      <w:iCs w:val="1"/>
+      <w:color w:val="666666"/>
+      <w:sz w:val="22"/>
+      <w:szCs w:val="22"/>
     </w:rPr>
   </w:style>
   <w:style w:type="paragraph" w:styleId="Title">
@@ -371,13 +696,11 @@
       <w:keepNext w:val="1"/>
       <w:keepLines w:val="1"/>
       <w:pageBreakBefore w:val="0"/>
-      <w:spacing w:after="120" w:before="480" w:lineRule="auto"/>
+      <w:spacing w:after="60" w:before="0" w:lineRule="auto"/>
     </w:pPr>
     <w:rPr>
-      <w:b w:val="1"/>
-      <w:bCs w:val="1"/>
-      <w:sz w:val="72"/>
-      <w:szCs w:val="72"/>
+      <w:sz w:val="52"/>
+      <w:szCs w:val="52"/>
     </w:rPr>
   </w:style>
   <w:style w:type="paragraph" w:styleId="Subtitle">
@@ -388,15 +711,15 @@
       <w:keepNext w:val="1"/>
       <w:keepLines w:val="1"/>
       <w:pageBreakBefore w:val="0"/>
-      <w:spacing w:after="80" w:before="360" w:lineRule="auto"/>
+      <w:spacing w:after="320" w:before="0" w:lineRule="auto"/>
     </w:pPr>
     <w:rPr>
-      <w:rFonts w:ascii="Georgia" w:cs="Georgia" w:eastAsia="Georgia" w:hAnsi="Georgia"/>
-      <w:i w:val="1"/>
-      <w:iCs w:val="1"/>
+      <w:rFonts w:ascii="Arial" w:cs="Arial" w:eastAsia="Arial" w:hAnsi="Arial"/>
+      <w:i w:val="0"/>
+      <w:iCs w:val="0"/>
       <w:color w:val="666666"/>
-      <w:sz w:val="48"/>
-      <w:szCs w:val="48"/>
+      <w:sz w:val="30"/>
+      <w:szCs w:val="30"/>
     </w:rPr>
   </w:style>
 </w:styles>
@@ -720,19 +1043,4 @@
   </a:objectDefaults>
   <a:extraClrSchemeLst/>
 </a:theme>
-</file>
-
-<file path=customXML/item1.xml><?xml version="1.0" encoding="utf-8"?>
-<go:gDocsCustomXmlDataStorage xmlns:go="http://customooxmlschemas.google.com/" xmlns:r="http://schemas.openxmlformats.org/officeDocument/2006/relationships" uri="GoogleDocsCustomDataVersion2">
-  <go:docsCustomData xmlns:go="http://customooxmlschemas.google.com/" roundtripDataSignature="AMtx7mjz9rF40LUYebqcdOH5i7vK1D/wLA==">CgMxLjAyDmguMmpvbzloaTM3ZjdoMg5oLjY2MWhyZjk0amxibzgAciExRGVGSG9iVnFQcGx2X2otclM3WVNzY2pUcUR6V1pNY0w=</go:docsCustomData>
-</go:gDocsCustomXmlDataStorage>
-</file>
-
-<file path=customXML/itemProps1.xml><?xml version="1.0" encoding="utf-8"?>
-<ds:datastoreItem xmlns:ds="http://schemas.openxmlformats.org/officeDocument/2006/customXml" ds:itemID="{11111111-1234-1234-1234-123412341234}">
-  <ds:schemaRefs>
-    <ds:schemaRef ds:uri="http://schemas.openxmlformats.org/officeDocument/2006/relationships"/>
-    <ds:schemaRef ds:uri="http://customooxmlschemas.google.com/"/>
-  </ds:schemaRefs>
-</ds:datastoreItem>
 </file>
</xml_diff>